<commit_message>
Propagate expanded Q3 content into the 4 windowed docx files
W1 (Jul1-15): added the Chitrakoot Mangal Milan item (Jul13).
W2 (Jul16-30): added Muni Samvegaratna Sagar's Chaturmas pravesh (Jul22)
and the ₹53 crore ceremonial kalash bidding (Jul30); expanded the
Terapanth Foundation Day item with the Sadhvi Lakshyaprabha detail.
W3 and W4 unchanged — the added items don't fall in their date ranges.

Co-Authored-By: Claude Sonnet 5 <noreply@anthropic.com>
Claude-Session: https://claude.ai/code/session_01FU2eXb1yBzQGtYCFiFpbPt
</commit_message>
<xml_diff>
--- a/automation/issues/JainMagazine_W1_Jul1-15_2026.docx
+++ b/automation/issues/JainMagazine_W1_Jul1-15_2026.docx
@@ -144,7 +144,7 @@
         </w:rPr>
         <w:t xml:space="preserve">  →  </w:t>
       </w:r>
-      <w:hyperlink w:history="1" r:id="rIdokvkrxh_pwaaumasjflir">
+      <w:hyperlink w:history="1" r:id="rIdvziszwbnhjjpithlnns_g">
         <w:r>
           <w:rPr>
             <w:rFonts w:ascii="Arial" w:cs="Arial" w:eastAsia="Arial" w:hAnsi="Arial"/>
@@ -240,7 +240,7 @@
         </w:rPr>
         <w:t xml:space="preserve">  →  </w:t>
       </w:r>
-      <w:hyperlink w:history="1" r:id="rIdasasiudhicqfrfif6uu8a">
+      <w:hyperlink w:history="1" r:id="rIdllfjg1shavrnfoj8oc2ti">
         <w:r>
           <w:rPr>
             <w:rFonts w:ascii="Arial" w:cs="Arial" w:eastAsia="Arial" w:hAnsi="Arial"/>
@@ -336,7 +336,7 @@
         </w:rPr>
         <w:t xml:space="preserve">  →  </w:t>
       </w:r>
-      <w:hyperlink w:history="1" r:id="rId7w99oy5k9vggh-3jvyopd">
+      <w:hyperlink w:history="1" r:id="rIdkakn0x3py3ceyr65ott-b">
         <w:r>
           <w:rPr>
             <w:rFonts w:ascii="Arial" w:cs="Arial" w:eastAsia="Arial" w:hAnsi="Arial"/>
@@ -415,7 +415,7 @@
         </w:rPr>
         <w:t xml:space="preserve">  →  </w:t>
       </w:r>
-      <w:hyperlink w:history="1" r:id="rId5afexzpbkkugb2az4c9ec">
+      <w:hyperlink w:history="1" r:id="rIdwuz7vqmcqurs_xcezbmzq">
         <w:r>
           <w:rPr>
             <w:rFonts w:ascii="Arial" w:cs="Arial" w:eastAsia="Arial" w:hAnsi="Arial"/>
@@ -482,6 +482,85 @@
           <w:sz w:val="25"/>
           <w:szCs w:val="25"/>
         </w:rPr>
+        <w:t xml:space="preserve">'Mangal Milan' of Jain Monks Carries a Message of Non-Violence</w:t>
+      </w:r>
+    </w:p>
+    <w:p>
+      <w:pPr>
+        <w:spacing w:after="40"/>
+      </w:pPr>
+      <w:r>
+        <w:rPr>
+          <w:rFonts w:ascii="Arial" w:cs="Arial" w:eastAsia="Arial" w:hAnsi="Arial"/>
+          <w:b/>
+          <w:bCs/>
+          <w:color w:val="B9541F"/>
+          <w:sz w:val="17"/>
+          <w:szCs w:val="17"/>
+        </w:rPr>
+        <w:t xml:space="preserve">CHITRAKOOT, UTTAR PRADESH · SOURCE: AMAR UJALA · JUL 13, 2026</w:t>
+      </w:r>
+      <w:r>
+        <w:rPr>
+          <w:rFonts w:ascii="Arial" w:cs="Arial" w:eastAsia="Arial" w:hAnsi="Arial"/>
+          <w:b/>
+          <w:bCs/>
+          <w:color w:val="B9541F"/>
+          <w:sz w:val="17"/>
+          <w:szCs w:val="17"/>
+        </w:rPr>
+        <w:t xml:space="preserve">  →  </w:t>
+      </w:r>
+      <w:hyperlink w:history="1" r:id="rIdtk31w6w1dwjnrgqdrqnw1">
+        <w:r>
+          <w:rPr>
+            <w:rFonts w:ascii="Arial" w:cs="Arial" w:eastAsia="Arial" w:hAnsi="Arial"/>
+            <w:b/>
+            <w:bCs/>
+            <w:color w:val="1155CC"/>
+            <w:sz w:val="17"/>
+            <w:szCs w:val="17"/>
+            <w:u w:val="single"/>
+          </w:rPr>
+          <w:t xml:space="preserve">READ FULL ARTICLE</w:t>
+        </w:r>
+      </w:hyperlink>
+    </w:p>
+    <w:p>
+      <w:pPr>
+        <w:spacing w:after="80"/>
+      </w:pPr>
+      <w:r>
+        <w:rPr>
+          <w:rFonts w:ascii="Arial" w:cs="Arial" w:eastAsia="Arial" w:hAnsi="Arial"/>
+          <w:color w:val="33291F"/>
+          <w:sz w:val="21"/>
+          <w:szCs w:val="21"/>
+        </w:rPr>
+        <w:t xml:space="preserve">A devotional gathering in Chitrakoot marked the meeting (mangal milan) of Jain munis, centered on a shared message of ahimsa (non-violence) for the community — a reminder of the principle that runs through Jain teaching, delivered as visiting monastic groups crossed paths in the town.</w:t>
+      </w:r>
+    </w:p>
+    <w:p>
+      <w:pPr>
+        <w:pBdr>
+          <w:top w:val="single" w:color="D8CDB4" w:sz="4"/>
+        </w:pBdr>
+        <w:spacing w:after="160"/>
+      </w:pPr>
+    </w:p>
+    <w:p>
+      <w:pPr>
+        <w:spacing w:after="60" w:before="120"/>
+      </w:pPr>
+      <w:r>
+        <w:rPr>
+          <w:rFonts w:ascii="Georgia" w:cs="Georgia" w:eastAsia="Georgia" w:hAnsi="Georgia"/>
+          <w:b/>
+          <w:bCs/>
+          <w:color w:val="1C1712"/>
+          <w:sz w:val="25"/>
+          <w:szCs w:val="25"/>
+        </w:rPr>
         <w:t xml:space="preserve">Young Jains of America Holds 17th Biennial Convention</w:t>
       </w:r>
     </w:p>
@@ -511,7 +590,7 @@
         </w:rPr>
         <w:t xml:space="preserve">  →  </w:t>
       </w:r>
-      <w:hyperlink w:history="1" r:id="rIdzsofxwdl8aebzmz-ye-uw">
+      <w:hyperlink w:history="1" r:id="rIdltlwtlu2wmbdiy2n6zfsz">
         <w:r>
           <w:rPr>
             <w:rFonts w:ascii="Arial" w:cs="Arial" w:eastAsia="Arial" w:hAnsi="Arial"/>

</xml_diff>